<commit_message>
Update portfolio: modify index.html, update resume files, and replace Image3.jpg with Image3.png
</commit_message>
<xml_diff>
--- a/Images/My Resume.docx
+++ b/Images/My Resume.docx
@@ -204,6 +204,21 @@
           <w:bCs/>
         </w:rPr>
         <w:tab/>
+      </w:r>
+      <w:r>
+        <w:rPr>
+          <w:rFonts w:ascii="Times New Roman" w:hAnsi="Times New Roman" w:cs="Times New Roman"/>
+          <w:b/>
+          <w:bCs/>
+        </w:rPr>
+        <w:t xml:space="preserve">         </w:t>
+      </w:r>
+      <w:r>
+        <w:rPr>
+          <w:rFonts w:ascii="Times New Roman" w:hAnsi="Times New Roman" w:cs="Times New Roman"/>
+          <w:b/>
+          <w:bCs/>
+        </w:rPr>
         <w:t>May</w:t>
       </w:r>
       <w:r>
@@ -566,10 +581,31 @@
         <w:t xml:space="preserve"> matches </w:t>
       </w:r>
       <w:r>
-        <w:t xml:space="preserve">them against dynamically generated job descriptions using rule-based and AI-assisted </w:t>
-      </w:r>
-      <w:r>
-        <w:t>scoring logic.</w:t>
+        <w:t>them agains</w:t>
+      </w:r>
+      <w:r>
+        <w:t xml:space="preserve">t </w:t>
+      </w:r>
+      <w:r>
+        <w:t xml:space="preserve">enquired </w:t>
+      </w:r>
+      <w:r>
+        <w:t xml:space="preserve">job descriptions using rule-based and AI-assisted </w:t>
+      </w:r>
+      <w:r>
+        <w:t>scoring logic</w:t>
+      </w:r>
+      <w:r>
+        <w:t>, AST</w:t>
+      </w:r>
+      <w:r>
+        <w:t>,</w:t>
+      </w:r>
+      <w:r>
+        <w:t xml:space="preserve"> and</w:t>
+      </w:r>
+      <w:r>
+        <w:t xml:space="preserve"> PDF to Image conversion</w:t>
       </w:r>
     </w:p>
     <w:p>
@@ -624,7 +660,28 @@
           <w:b/>
           <w:bCs/>
         </w:rPr>
-        <w:t>FEBRUARY 2026</w:t>
+        <w:t xml:space="preserve">   </w:t>
+      </w:r>
+      <w:r>
+        <w:rPr>
+          <w:b/>
+          <w:bCs/>
+        </w:rPr>
+        <w:t>F</w:t>
+      </w:r>
+      <w:r>
+        <w:rPr>
+          <w:b/>
+          <w:bCs/>
+        </w:rPr>
+        <w:t>ebruary</w:t>
+      </w:r>
+      <w:r>
+        <w:rPr>
+          <w:b/>
+          <w:bCs/>
+        </w:rPr>
+        <w:t xml:space="preserve"> 2026</w:t>
       </w:r>
     </w:p>
     <w:p>
@@ -790,7 +847,6 @@
           <w:bCs/>
         </w:rPr>
         <w:tab/>
-        <w:t>March</w:t>
       </w:r>
       <w:r>
         <w:rPr>
@@ -798,6 +854,22 @@
           <w:b/>
           <w:bCs/>
         </w:rPr>
+        <w:t xml:space="preserve">     </w:t>
+      </w:r>
+      <w:r>
+        <w:rPr>
+          <w:rFonts w:ascii="Times New Roman" w:hAnsi="Times New Roman" w:cs="Times New Roman"/>
+          <w:b/>
+          <w:bCs/>
+        </w:rPr>
+        <w:t>March</w:t>
+      </w:r>
+      <w:r>
+        <w:rPr>
+          <w:rFonts w:ascii="Times New Roman" w:hAnsi="Times New Roman" w:cs="Times New Roman"/>
+          <w:b/>
+          <w:bCs/>
+        </w:rPr>
         <w:t xml:space="preserve"> 2025</w:t>
       </w:r>
       <w:r>
@@ -945,6 +1017,21 @@
           <w:bCs/>
         </w:rPr>
         <w:tab/>
+      </w:r>
+      <w:r>
+        <w:rPr>
+          <w:rFonts w:ascii="Times New Roman" w:hAnsi="Times New Roman" w:cs="Times New Roman"/>
+          <w:b/>
+          <w:bCs/>
+        </w:rPr>
+        <w:t xml:space="preserve">         </w:t>
+      </w:r>
+      <w:r>
+        <w:rPr>
+          <w:rFonts w:ascii="Times New Roman" w:hAnsi="Times New Roman" w:cs="Times New Roman"/>
+          <w:b/>
+          <w:bCs/>
+        </w:rPr>
         <w:t>May</w:t>
       </w:r>
       <w:r>
@@ -1090,7 +1177,7 @@
           <w:bCs/>
           <w:color w:val="000000" w:themeColor="text1"/>
         </w:rPr>
-        <w:t>July 2025 – Present</w:t>
+        <w:t xml:space="preserve">      </w:t>
       </w:r>
       <w:r>
         <w:rPr>
@@ -1099,108 +1186,8 @@
           <w:bCs/>
           <w:color w:val="000000" w:themeColor="text1"/>
         </w:rPr>
-        <w:br/>
-      </w:r>
-      <w:r>
-        <w:rPr>
-          <w:rFonts w:ascii="Times New Roman" w:hAnsi="Times New Roman" w:cs="Times New Roman"/>
-          <w:color w:val="000000" w:themeColor="text1"/>
-        </w:rPr>
-        <w:t xml:space="preserve">- </w:t>
-      </w:r>
-      <w:r>
-        <w:rPr>
-          <w:rFonts w:ascii="Times New Roman" w:hAnsi="Times New Roman" w:cs="Times New Roman"/>
-          <w:color w:val="000000" w:themeColor="text1"/>
-        </w:rPr>
-        <w:t>Le</w:t>
-      </w:r>
-      <w:r>
-        <w:rPr>
-          <w:rFonts w:ascii="Times New Roman" w:hAnsi="Times New Roman" w:cs="Times New Roman"/>
-          <w:color w:val="000000" w:themeColor="text1"/>
-        </w:rPr>
-        <w:t>ad</w:t>
-      </w:r>
-      <w:r>
-        <w:rPr>
-          <w:rFonts w:ascii="Times New Roman" w:hAnsi="Times New Roman" w:cs="Times New Roman"/>
-          <w:color w:val="000000" w:themeColor="text1"/>
-        </w:rPr>
-        <w:t xml:space="preserve"> programming </w:t>
-      </w:r>
-      <w:r>
-        <w:rPr>
-          <w:rFonts w:ascii="Times New Roman" w:hAnsi="Times New Roman" w:cs="Times New Roman"/>
-          <w:color w:val="000000" w:themeColor="text1"/>
-        </w:rPr>
-        <w:t xml:space="preserve">initiatives </w:t>
-      </w:r>
-      <w:r>
-        <w:rPr>
-          <w:rFonts w:ascii="Times New Roman" w:hAnsi="Times New Roman" w:cs="Times New Roman"/>
-          <w:color w:val="000000" w:themeColor="text1"/>
-        </w:rPr>
-        <w:t xml:space="preserve">for 100+ residents </w:t>
-      </w:r>
-      <w:r>
-        <w:rPr>
-          <w:rFonts w:ascii="Times New Roman" w:hAnsi="Times New Roman" w:cs="Times New Roman"/>
-          <w:color w:val="000000" w:themeColor="text1"/>
-        </w:rPr>
-        <w:t>while</w:t>
-      </w:r>
-      <w:r>
-        <w:rPr>
-          <w:rFonts w:ascii="Times New Roman" w:hAnsi="Times New Roman" w:cs="Times New Roman"/>
-          <w:color w:val="000000" w:themeColor="text1"/>
-        </w:rPr>
-        <w:t xml:space="preserve"> managing</w:t>
-      </w:r>
-      <w:r>
-        <w:rPr>
-          <w:rFonts w:ascii="Times New Roman" w:hAnsi="Times New Roman" w:cs="Times New Roman"/>
-          <w:color w:val="000000" w:themeColor="text1"/>
-        </w:rPr>
-        <w:t xml:space="preserve"> on-call crisis </w:t>
-      </w:r>
-      <w:r>
-        <w:rPr>
-          <w:rFonts w:ascii="Times New Roman" w:hAnsi="Times New Roman" w:cs="Times New Roman"/>
-          <w:color w:val="000000" w:themeColor="text1"/>
-        </w:rPr>
-        <w:t xml:space="preserve">response </w:t>
-      </w:r>
-      <w:r>
-        <w:rPr>
-          <w:rFonts w:ascii="Times New Roman" w:hAnsi="Times New Roman" w:cs="Times New Roman"/>
-          <w:color w:val="000000" w:themeColor="text1"/>
-        </w:rPr>
-        <w:t>responsibilities.</w:t>
-      </w:r>
-    </w:p>
-    <w:p>
-      <w:pPr>
-        <w:rPr>
-          <w:rFonts w:ascii="Times New Roman" w:hAnsi="Times New Roman" w:cs="Times New Roman"/>
-          <w:color w:val="000000" w:themeColor="text1"/>
-        </w:rPr>
-      </w:pPr>
-      <w:r>
-        <w:rPr>
-          <w:rFonts w:ascii="Times New Roman" w:hAnsi="Times New Roman" w:cs="Times New Roman"/>
-          <w:color w:val="000000" w:themeColor="text1"/>
-        </w:rPr>
-        <w:t>-Apply structured problem-solving and conflict resolution strategies in high-pressure environments.</w:t>
-      </w:r>
-    </w:p>
-    <w:p>
-      <w:pPr>
-        <w:rPr>
-          <w:rFonts w:ascii="Times New Roman" w:hAnsi="Times New Roman" w:cs="Times New Roman"/>
-          <w:color w:val="000000" w:themeColor="text1"/>
-        </w:rPr>
-      </w:pPr>
+        <w:t>July 2025 – Present</w:t>
+      </w:r>
       <w:r>
         <w:rPr>
           <w:rFonts w:ascii="Times New Roman" w:hAnsi="Times New Roman" w:cs="Times New Roman"/>
@@ -1208,18 +1195,111 @@
           <w:bCs/>
           <w:color w:val="000000" w:themeColor="text1"/>
         </w:rPr>
-        <w:t xml:space="preserve">Student Assistant – Dining Commons, Georgia Southern University </w:t>
-      </w:r>
-      <w:r>
+        <w:br/>
+      </w:r>
+      <w:r>
+        <w:rPr>
+          <w:rFonts w:ascii="Times New Roman" w:hAnsi="Times New Roman" w:cs="Times New Roman"/>
+          <w:color w:val="000000" w:themeColor="text1"/>
+        </w:rPr>
+        <w:t xml:space="preserve">- </w:t>
+      </w:r>
+      <w:r>
+        <w:rPr>
+          <w:rFonts w:ascii="Times New Roman" w:hAnsi="Times New Roman" w:cs="Times New Roman"/>
+          <w:color w:val="000000" w:themeColor="text1"/>
+        </w:rPr>
+        <w:t>Le</w:t>
+      </w:r>
+      <w:r>
+        <w:rPr>
+          <w:rFonts w:ascii="Times New Roman" w:hAnsi="Times New Roman" w:cs="Times New Roman"/>
+          <w:color w:val="000000" w:themeColor="text1"/>
+        </w:rPr>
+        <w:t>ad</w:t>
+      </w:r>
+      <w:r>
+        <w:rPr>
+          <w:rFonts w:ascii="Times New Roman" w:hAnsi="Times New Roman" w:cs="Times New Roman"/>
+          <w:color w:val="000000" w:themeColor="text1"/>
+        </w:rPr>
+        <w:t xml:space="preserve"> programming </w:t>
+      </w:r>
+      <w:r>
+        <w:rPr>
+          <w:rFonts w:ascii="Times New Roman" w:hAnsi="Times New Roman" w:cs="Times New Roman"/>
+          <w:color w:val="000000" w:themeColor="text1"/>
+        </w:rPr>
+        <w:t xml:space="preserve">initiatives </w:t>
+      </w:r>
+      <w:r>
+        <w:rPr>
+          <w:rFonts w:ascii="Times New Roman" w:hAnsi="Times New Roman" w:cs="Times New Roman"/>
+          <w:color w:val="000000" w:themeColor="text1"/>
+        </w:rPr>
+        <w:t xml:space="preserve">for 100+ residents </w:t>
+      </w:r>
+      <w:r>
+        <w:rPr>
+          <w:rFonts w:ascii="Times New Roman" w:hAnsi="Times New Roman" w:cs="Times New Roman"/>
+          <w:color w:val="000000" w:themeColor="text1"/>
+        </w:rPr>
+        <w:t>while</w:t>
+      </w:r>
+      <w:r>
+        <w:rPr>
+          <w:rFonts w:ascii="Times New Roman" w:hAnsi="Times New Roman" w:cs="Times New Roman"/>
+          <w:color w:val="000000" w:themeColor="text1"/>
+        </w:rPr>
+        <w:t xml:space="preserve"> managing</w:t>
+      </w:r>
+      <w:r>
+        <w:rPr>
+          <w:rFonts w:ascii="Times New Roman" w:hAnsi="Times New Roman" w:cs="Times New Roman"/>
+          <w:color w:val="000000" w:themeColor="text1"/>
+        </w:rPr>
+        <w:t xml:space="preserve"> on-call crisis </w:t>
+      </w:r>
+      <w:r>
+        <w:rPr>
+          <w:rFonts w:ascii="Times New Roman" w:hAnsi="Times New Roman" w:cs="Times New Roman"/>
+          <w:color w:val="000000" w:themeColor="text1"/>
+        </w:rPr>
+        <w:t xml:space="preserve">response </w:t>
+      </w:r>
+      <w:r>
+        <w:rPr>
+          <w:rFonts w:ascii="Times New Roman" w:hAnsi="Times New Roman" w:cs="Times New Roman"/>
+          <w:color w:val="000000" w:themeColor="text1"/>
+        </w:rPr>
+        <w:t>responsibilities.</w:t>
+      </w:r>
+    </w:p>
+    <w:p>
+      <w:pPr>
+        <w:rPr>
+          <w:rFonts w:ascii="Times New Roman" w:hAnsi="Times New Roman" w:cs="Times New Roman"/>
+          <w:color w:val="000000" w:themeColor="text1"/>
+        </w:rPr>
+      </w:pPr>
+      <w:r>
+        <w:rPr>
+          <w:rFonts w:ascii="Times New Roman" w:hAnsi="Times New Roman" w:cs="Times New Roman"/>
+          <w:color w:val="000000" w:themeColor="text1"/>
+        </w:rPr>
+        <w:t>-Apply structured problem-solving and conflict resolution strategies in high-pressure environments.</w:t>
+      </w:r>
+    </w:p>
+    <w:p>
+      <w:pPr>
+        <w:spacing w:line="240" w:lineRule="auto"/>
         <w:rPr>
           <w:rFonts w:ascii="Times New Roman" w:hAnsi="Times New Roman" w:cs="Times New Roman"/>
           <w:b/>
           <w:bCs/>
           <w:color w:val="000000" w:themeColor="text1"/>
         </w:rPr>
-        <w:tab/>
-        <w:t xml:space="preserve"> </w:t>
-      </w:r>
+      </w:pPr>
       <w:r>
         <w:rPr>
           <w:rFonts w:ascii="Times New Roman" w:hAnsi="Times New Roman" w:cs="Times New Roman"/>
@@ -1227,7 +1307,7 @@
           <w:bCs/>
           <w:color w:val="000000" w:themeColor="text1"/>
         </w:rPr>
-        <w:t xml:space="preserve">  </w:t>
+        <w:t>Student Assistant – Dining Commons</w:t>
       </w:r>
       <w:r>
         <w:rPr>
@@ -1236,7 +1316,7 @@
           <w:bCs/>
           <w:color w:val="000000" w:themeColor="text1"/>
         </w:rPr>
-        <w:t>Sept 2024 – Nov 2024</w:t>
+        <w:t xml:space="preserve">. </w:t>
       </w:r>
       <w:r>
         <w:rPr>
@@ -1245,93 +1325,8 @@
           <w:bCs/>
           <w:color w:val="000000" w:themeColor="text1"/>
         </w:rPr>
-        <w:br/>
-      </w:r>
-      <w:r>
-        <w:rPr>
-          <w:rFonts w:ascii="Times New Roman" w:hAnsi="Times New Roman" w:cs="Times New Roman"/>
-          <w:color w:val="000000" w:themeColor="text1"/>
-        </w:rPr>
-        <w:t xml:space="preserve">- </w:t>
-      </w:r>
-      <w:r>
-        <w:rPr>
-          <w:rFonts w:ascii="Times New Roman" w:hAnsi="Times New Roman" w:cs="Times New Roman"/>
-          <w:color w:val="000000" w:themeColor="text1"/>
-        </w:rPr>
-        <w:t xml:space="preserve">Improved </w:t>
-      </w:r>
-      <w:r>
-        <w:rPr>
-          <w:rFonts w:ascii="Times New Roman" w:hAnsi="Times New Roman" w:cs="Times New Roman"/>
-          <w:color w:val="000000" w:themeColor="text1"/>
-        </w:rPr>
-        <w:t xml:space="preserve">scheduling </w:t>
-      </w:r>
-      <w:r>
-        <w:rPr>
-          <w:rFonts w:ascii="Times New Roman" w:hAnsi="Times New Roman" w:cs="Times New Roman"/>
-          <w:color w:val="000000" w:themeColor="text1"/>
-        </w:rPr>
-        <w:t xml:space="preserve">efficiency </w:t>
-      </w:r>
-      <w:r>
-        <w:rPr>
-          <w:rFonts w:ascii="Times New Roman" w:hAnsi="Times New Roman" w:cs="Times New Roman"/>
-          <w:color w:val="000000" w:themeColor="text1"/>
-        </w:rPr>
-        <w:t xml:space="preserve">for 200+ staff </w:t>
-      </w:r>
-      <w:r>
-        <w:rPr>
-          <w:rFonts w:ascii="Times New Roman" w:hAnsi="Times New Roman" w:cs="Times New Roman"/>
-          <w:color w:val="000000" w:themeColor="text1"/>
-        </w:rPr>
-        <w:t xml:space="preserve">members </w:t>
-      </w:r>
-      <w:r>
-        <w:rPr>
-          <w:rFonts w:ascii="Times New Roman" w:hAnsi="Times New Roman" w:cs="Times New Roman"/>
-          <w:color w:val="000000" w:themeColor="text1"/>
-        </w:rPr>
-        <w:t xml:space="preserve">using Excel-based </w:t>
-      </w:r>
-      <w:r>
-        <w:rPr>
-          <w:rFonts w:ascii="Times New Roman" w:hAnsi="Times New Roman" w:cs="Times New Roman"/>
-          <w:color w:val="000000" w:themeColor="text1"/>
-        </w:rPr>
-        <w:t xml:space="preserve">workflow </w:t>
-      </w:r>
-      <w:r>
-        <w:rPr>
-          <w:rFonts w:ascii="Times New Roman" w:hAnsi="Times New Roman" w:cs="Times New Roman"/>
-          <w:color w:val="000000" w:themeColor="text1"/>
-        </w:rPr>
-        <w:t xml:space="preserve">systems, reducing shift </w:t>
-      </w:r>
-      <w:r>
-        <w:rPr>
-          <w:rFonts w:ascii="Times New Roman" w:hAnsi="Times New Roman" w:cs="Times New Roman"/>
-          <w:color w:val="000000" w:themeColor="text1"/>
-        </w:rPr>
-        <w:t>conflicts</w:t>
-      </w:r>
-      <w:r>
-        <w:rPr>
-          <w:rFonts w:ascii="Times New Roman" w:hAnsi="Times New Roman" w:cs="Times New Roman"/>
-          <w:color w:val="000000" w:themeColor="text1"/>
-        </w:rPr>
-        <w:t xml:space="preserve"> by 15%.</w:t>
-      </w:r>
-    </w:p>
-    <w:p>
-      <w:pPr>
-        <w:rPr>
-          <w:rFonts w:ascii="Times New Roman" w:hAnsi="Times New Roman" w:cs="Times New Roman"/>
-          <w:color w:val="000000" w:themeColor="text1"/>
-        </w:rPr>
-      </w:pPr>
+        <w:t xml:space="preserve">Georgia Southern University </w:t>
+      </w:r>
       <w:r>
         <w:rPr>
           <w:rFonts w:ascii="Times New Roman" w:hAnsi="Times New Roman" w:cs="Times New Roman"/>
@@ -1339,9 +1334,9 @@
           <w:bCs/>
           <w:color w:val="000000" w:themeColor="text1"/>
         </w:rPr>
-        <w:t xml:space="preserve">Personal Assistant – </w:t>
-      </w:r>
-      <w:proofErr w:type="spellStart"/>
+        <w:tab/>
+        <w:t xml:space="preserve"> </w:t>
+      </w:r>
       <w:r>
         <w:rPr>
           <w:rFonts w:ascii="Times New Roman" w:hAnsi="Times New Roman" w:cs="Times New Roman"/>
@@ -1349,18 +1344,20 @@
           <w:bCs/>
           <w:color w:val="000000" w:themeColor="text1"/>
         </w:rPr>
-        <w:t>Margrail</w:t>
-      </w:r>
-      <w:proofErr w:type="spellEnd"/>
-      <w:r>
+        <w:t xml:space="preserve">  </w:t>
+      </w:r>
+    </w:p>
+    <w:p>
+      <w:pPr>
+        <w:spacing w:line="240" w:lineRule="auto"/>
+        <w:ind w:firstLine="720"/>
         <w:rPr>
           <w:rFonts w:ascii="Times New Roman" w:hAnsi="Times New Roman" w:cs="Times New Roman"/>
           <w:b/>
           <w:bCs/>
           <w:color w:val="000000" w:themeColor="text1"/>
         </w:rPr>
-        <w:t xml:space="preserve"> Limited (International)</w:t>
-      </w:r>
+      </w:pPr>
       <w:r>
         <w:rPr>
           <w:rFonts w:ascii="Times New Roman" w:hAnsi="Times New Roman" w:cs="Times New Roman"/>
@@ -1368,7 +1365,7 @@
           <w:bCs/>
           <w:color w:val="000000" w:themeColor="text1"/>
         </w:rPr>
-        <w:tab/>
+        <w:t xml:space="preserve">                                                                                                </w:t>
       </w:r>
       <w:r>
         <w:rPr>
@@ -1377,8 +1374,193 @@
           <w:bCs/>
           <w:color w:val="000000" w:themeColor="text1"/>
         </w:rPr>
+        <w:t>Sept</w:t>
+      </w:r>
+      <w:r>
+        <w:rPr>
+          <w:rFonts w:ascii="Times New Roman" w:hAnsi="Times New Roman" w:cs="Times New Roman"/>
+          <w:b/>
+          <w:bCs/>
+          <w:color w:val="000000" w:themeColor="text1"/>
+        </w:rPr>
+        <w:t>ember</w:t>
+      </w:r>
+      <w:r>
+        <w:rPr>
+          <w:rFonts w:ascii="Times New Roman" w:hAnsi="Times New Roman" w:cs="Times New Roman"/>
+          <w:b/>
+          <w:bCs/>
+          <w:color w:val="000000" w:themeColor="text1"/>
+        </w:rPr>
+        <w:t xml:space="preserve"> 2024 – Nov 2024</w:t>
+      </w:r>
+      <w:r>
+        <w:rPr>
+          <w:rFonts w:ascii="Times New Roman" w:hAnsi="Times New Roman" w:cs="Times New Roman"/>
+          <w:b/>
+          <w:bCs/>
+          <w:color w:val="000000" w:themeColor="text1"/>
+        </w:rPr>
+        <w:br/>
+      </w:r>
+      <w:r>
+        <w:rPr>
+          <w:rFonts w:ascii="Times New Roman" w:hAnsi="Times New Roman" w:cs="Times New Roman"/>
+          <w:color w:val="000000" w:themeColor="text1"/>
+        </w:rPr>
+        <w:t xml:space="preserve">- </w:t>
+      </w:r>
+      <w:r>
+        <w:rPr>
+          <w:rFonts w:ascii="Times New Roman" w:hAnsi="Times New Roman" w:cs="Times New Roman"/>
+          <w:color w:val="000000" w:themeColor="text1"/>
+        </w:rPr>
+        <w:t xml:space="preserve">Improved </w:t>
+      </w:r>
+      <w:r>
+        <w:rPr>
+          <w:rFonts w:ascii="Times New Roman" w:hAnsi="Times New Roman" w:cs="Times New Roman"/>
+          <w:color w:val="000000" w:themeColor="text1"/>
+        </w:rPr>
+        <w:t xml:space="preserve">scheduling </w:t>
+      </w:r>
+      <w:r>
+        <w:rPr>
+          <w:rFonts w:ascii="Times New Roman" w:hAnsi="Times New Roman" w:cs="Times New Roman"/>
+          <w:color w:val="000000" w:themeColor="text1"/>
+        </w:rPr>
+        <w:t xml:space="preserve">efficiency </w:t>
+      </w:r>
+      <w:r>
+        <w:rPr>
+          <w:rFonts w:ascii="Times New Roman" w:hAnsi="Times New Roman" w:cs="Times New Roman"/>
+          <w:color w:val="000000" w:themeColor="text1"/>
+        </w:rPr>
+        <w:t xml:space="preserve">for 200+ staff </w:t>
+      </w:r>
+      <w:r>
+        <w:rPr>
+          <w:rFonts w:ascii="Times New Roman" w:hAnsi="Times New Roman" w:cs="Times New Roman"/>
+          <w:color w:val="000000" w:themeColor="text1"/>
+        </w:rPr>
+        <w:t xml:space="preserve">members </w:t>
+      </w:r>
+      <w:r>
+        <w:rPr>
+          <w:rFonts w:ascii="Times New Roman" w:hAnsi="Times New Roman" w:cs="Times New Roman"/>
+          <w:color w:val="000000" w:themeColor="text1"/>
+        </w:rPr>
+        <w:t xml:space="preserve">using Excel-based </w:t>
+      </w:r>
+      <w:r>
+        <w:rPr>
+          <w:rFonts w:ascii="Times New Roman" w:hAnsi="Times New Roman" w:cs="Times New Roman"/>
+          <w:color w:val="000000" w:themeColor="text1"/>
+        </w:rPr>
+        <w:t xml:space="preserve">workflow </w:t>
+      </w:r>
+      <w:r>
+        <w:rPr>
+          <w:rFonts w:ascii="Times New Roman" w:hAnsi="Times New Roman" w:cs="Times New Roman"/>
+          <w:color w:val="000000" w:themeColor="text1"/>
+        </w:rPr>
+        <w:t xml:space="preserve">systems, reducing shift </w:t>
+      </w:r>
+      <w:r>
+        <w:rPr>
+          <w:rFonts w:ascii="Times New Roman" w:hAnsi="Times New Roman" w:cs="Times New Roman"/>
+          <w:color w:val="000000" w:themeColor="text1"/>
+        </w:rPr>
+        <w:t>conflicts</w:t>
+      </w:r>
+      <w:r>
+        <w:rPr>
+          <w:rFonts w:ascii="Times New Roman" w:hAnsi="Times New Roman" w:cs="Times New Roman"/>
+          <w:color w:val="000000" w:themeColor="text1"/>
+        </w:rPr>
+        <w:t xml:space="preserve"> by 15%.</w:t>
+      </w:r>
+    </w:p>
+    <w:p>
+      <w:pPr>
+        <w:rPr>
+          <w:rFonts w:ascii="Times New Roman" w:hAnsi="Times New Roman" w:cs="Times New Roman"/>
+          <w:color w:val="000000" w:themeColor="text1"/>
+        </w:rPr>
+      </w:pPr>
+      <w:r>
+        <w:rPr>
+          <w:rFonts w:ascii="Times New Roman" w:hAnsi="Times New Roman" w:cs="Times New Roman"/>
+          <w:b/>
+          <w:bCs/>
+          <w:color w:val="000000" w:themeColor="text1"/>
+        </w:rPr>
+        <w:t xml:space="preserve">Personal Assistant – </w:t>
+      </w:r>
+      <w:proofErr w:type="spellStart"/>
+      <w:r>
+        <w:rPr>
+          <w:rFonts w:ascii="Times New Roman" w:hAnsi="Times New Roman" w:cs="Times New Roman"/>
+          <w:b/>
+          <w:bCs/>
+          <w:color w:val="000000" w:themeColor="text1"/>
+        </w:rPr>
+        <w:t>Margrail</w:t>
+      </w:r>
+      <w:proofErr w:type="spellEnd"/>
+      <w:r>
+        <w:rPr>
+          <w:rFonts w:ascii="Times New Roman" w:hAnsi="Times New Roman" w:cs="Times New Roman"/>
+          <w:b/>
+          <w:bCs/>
+          <w:color w:val="000000" w:themeColor="text1"/>
+        </w:rPr>
+        <w:t xml:space="preserve"> Limited (International)</w:t>
+      </w:r>
+      <w:r>
+        <w:rPr>
+          <w:rFonts w:ascii="Times New Roman" w:hAnsi="Times New Roman" w:cs="Times New Roman"/>
+          <w:b/>
+          <w:bCs/>
+          <w:color w:val="000000" w:themeColor="text1"/>
+        </w:rPr>
         <w:tab/>
-        <w:t xml:space="preserve">  July 2022 – Aug 2023</w:t>
+      </w:r>
+      <w:r>
+        <w:rPr>
+          <w:rFonts w:ascii="Times New Roman" w:hAnsi="Times New Roman" w:cs="Times New Roman"/>
+          <w:b/>
+          <w:bCs/>
+          <w:color w:val="000000" w:themeColor="text1"/>
+        </w:rPr>
+        <w:t xml:space="preserve">           </w:t>
+      </w:r>
+      <w:r>
+        <w:rPr>
+          <w:rFonts w:ascii="Times New Roman" w:hAnsi="Times New Roman" w:cs="Times New Roman"/>
+          <w:b/>
+          <w:bCs/>
+          <w:color w:val="000000" w:themeColor="text1"/>
+        </w:rPr>
+        <w:t>July 2022 – Aug</w:t>
+      </w:r>
+      <w:r>
+        <w:rPr>
+          <w:rFonts w:ascii="Times New Roman" w:hAnsi="Times New Roman" w:cs="Times New Roman"/>
+          <w:b/>
+          <w:bCs/>
+          <w:color w:val="000000" w:themeColor="text1"/>
+        </w:rPr>
+        <w:t>ust</w:t>
+      </w:r>
+      <w:r>
+        <w:rPr>
+          <w:rFonts w:ascii="Times New Roman" w:hAnsi="Times New Roman" w:cs="Times New Roman"/>
+          <w:b/>
+          <w:bCs/>
+          <w:color w:val="000000" w:themeColor="text1"/>
+        </w:rPr>
+        <w:t xml:space="preserve"> 2023</w:t>
       </w:r>
       <w:r>
         <w:rPr>
@@ -1518,7 +1700,7 @@
           <w:color w:val="0D0D0D" w:themeColor="text1" w:themeTint="F2"/>
         </w:rPr>
         <w:tab/>
-        <w:t xml:space="preserve">    Aug 2025 – Present</w:t>
+        <w:t xml:space="preserve"> Aug</w:t>
       </w:r>
       <w:r>
         <w:rPr>
@@ -1527,23 +1709,8 @@
           <w:bCs/>
           <w:color w:val="0D0D0D" w:themeColor="text1" w:themeTint="F2"/>
         </w:rPr>
-        <w:br/>
-      </w:r>
-      <w:r>
-        <w:rPr>
-          <w:rFonts w:ascii="Times New Roman" w:hAnsi="Times New Roman" w:cs="Times New Roman"/>
-          <w:color w:val="0D0D0D" w:themeColor="text1" w:themeTint="F2"/>
-        </w:rPr>
-        <w:t>- Coordinate meetings and manage communications to support coding workshops, using organizational tools and clear record-keeping to foster collaboration and increase member engagement.</w:t>
-      </w:r>
-    </w:p>
-    <w:p>
-      <w:pPr>
-        <w:rPr>
-          <w:rFonts w:ascii="Times New Roman" w:hAnsi="Times New Roman" w:cs="Times New Roman"/>
-          <w:color w:val="0D0D0D" w:themeColor="text1" w:themeTint="F2"/>
-        </w:rPr>
-      </w:pPr>
+        <w:t>ust</w:t>
+      </w:r>
       <w:r>
         <w:rPr>
           <w:rFonts w:ascii="Times New Roman" w:hAnsi="Times New Roman" w:cs="Times New Roman"/>
@@ -1551,8 +1718,7 @@
           <w:bCs/>
           <w:color w:val="0D0D0D" w:themeColor="text1" w:themeTint="F2"/>
         </w:rPr>
-        <w:lastRenderedPageBreak/>
-        <w:t>Member - Society of Women Engineers (SWE)</w:t>
+        <w:t xml:space="preserve"> 2025 – Present</w:t>
       </w:r>
       <w:r>
         <w:rPr>
@@ -1561,8 +1727,23 @@
           <w:bCs/>
           <w:color w:val="0D0D0D" w:themeColor="text1" w:themeTint="F2"/>
         </w:rPr>
-        <w:tab/>
-      </w:r>
+        <w:br/>
+      </w:r>
+      <w:r>
+        <w:rPr>
+          <w:rFonts w:ascii="Times New Roman" w:hAnsi="Times New Roman" w:cs="Times New Roman"/>
+          <w:color w:val="0D0D0D" w:themeColor="text1" w:themeTint="F2"/>
+        </w:rPr>
+        <w:t>- Coordinate meetings and manage communications to support coding workshops, using organizational tools and clear record-keeping to foster collaboration and increase member engagement.</w:t>
+      </w:r>
+    </w:p>
+    <w:p>
+      <w:pPr>
+        <w:rPr>
+          <w:rFonts w:ascii="Times New Roman" w:hAnsi="Times New Roman" w:cs="Times New Roman"/>
+          <w:color w:val="0D0D0D" w:themeColor="text1" w:themeTint="F2"/>
+        </w:rPr>
+      </w:pPr>
       <w:r>
         <w:rPr>
           <w:rFonts w:ascii="Times New Roman" w:hAnsi="Times New Roman" w:cs="Times New Roman"/>
@@ -1570,7 +1751,8 @@
           <w:bCs/>
           <w:color w:val="0D0D0D" w:themeColor="text1" w:themeTint="F2"/>
         </w:rPr>
-        <w:tab/>
+        <w:lastRenderedPageBreak/>
+        <w:t>Member - Society of Women Engineers (SWE)</w:t>
       </w:r>
       <w:r>
         <w:rPr>
@@ -1580,31 +1762,7 @@
           <w:color w:val="0D0D0D" w:themeColor="text1" w:themeTint="F2"/>
         </w:rPr>
         <w:tab/>
-        <w:t xml:space="preserve">    May 2024 – Presen</w:t>
-      </w:r>
-      <w:r>
-        <w:rPr>
-          <w:rFonts w:ascii="Times New Roman" w:hAnsi="Times New Roman" w:cs="Times New Roman"/>
-          <w:color w:val="0D0D0D" w:themeColor="text1" w:themeTint="F2"/>
-        </w:rPr>
-        <w:t>t</w:t>
-      </w:r>
-      <w:r>
-        <w:rPr>
-          <w:rFonts w:ascii="Times New Roman" w:hAnsi="Times New Roman" w:cs="Times New Roman"/>
-          <w:color w:val="0D0D0D" w:themeColor="text1" w:themeTint="F2"/>
-        </w:rPr>
-        <w:br/>
-        <w:t>- Participate in professional development and networking opportunities, leveraging exposure to industry events to strengthen teamwork and leadership skills.</w:t>
-      </w:r>
-    </w:p>
-    <w:p>
-      <w:pPr>
-        <w:rPr>
-          <w:rFonts w:ascii="Times New Roman" w:hAnsi="Times New Roman" w:cs="Times New Roman"/>
-          <w:color w:val="000000" w:themeColor="text1"/>
-        </w:rPr>
-      </w:pPr>
+      </w:r>
       <w:r>
         <w:rPr>
           <w:rFonts w:ascii="Times New Roman" w:hAnsi="Times New Roman" w:cs="Times New Roman"/>
@@ -1612,7 +1770,7 @@
           <w:bCs/>
           <w:color w:val="0D0D0D" w:themeColor="text1" w:themeTint="F2"/>
         </w:rPr>
-        <w:t>Member - National Society of Black Engineers (NSBE)</w:t>
+        <w:tab/>
       </w:r>
       <w:r>
         <w:rPr>
@@ -1622,6 +1780,7 @@
           <w:color w:val="0D0D0D" w:themeColor="text1" w:themeTint="F2"/>
         </w:rPr>
         <w:tab/>
+        <w:t xml:space="preserve">    </w:t>
       </w:r>
       <w:r>
         <w:rPr>
@@ -1630,8 +1789,85 @@
           <w:bCs/>
           <w:color w:val="0D0D0D" w:themeColor="text1" w:themeTint="F2"/>
         </w:rPr>
+        <w:t xml:space="preserve"> </w:t>
+      </w:r>
+      <w:r>
+        <w:rPr>
+          <w:rFonts w:ascii="Times New Roman" w:hAnsi="Times New Roman" w:cs="Times New Roman"/>
+          <w:b/>
+          <w:bCs/>
+          <w:color w:val="0D0D0D" w:themeColor="text1" w:themeTint="F2"/>
+        </w:rPr>
+        <w:t>May 2024 – Presen</w:t>
+      </w:r>
+      <w:r>
+        <w:rPr>
+          <w:rFonts w:ascii="Times New Roman" w:hAnsi="Times New Roman" w:cs="Times New Roman"/>
+          <w:color w:val="0D0D0D" w:themeColor="text1" w:themeTint="F2"/>
+        </w:rPr>
+        <w:t>t</w:t>
+      </w:r>
+      <w:r>
+        <w:rPr>
+          <w:rFonts w:ascii="Times New Roman" w:hAnsi="Times New Roman" w:cs="Times New Roman"/>
+          <w:color w:val="0D0D0D" w:themeColor="text1" w:themeTint="F2"/>
+        </w:rPr>
+        <w:br/>
+        <w:t>- Participate in professional development and networking opportunities, leveraging exposure to industry events to strengthen teamwork and leadership skills.</w:t>
+      </w:r>
+    </w:p>
+    <w:p>
+      <w:pPr>
+        <w:rPr>
+          <w:rFonts w:ascii="Times New Roman" w:hAnsi="Times New Roman" w:cs="Times New Roman"/>
+          <w:color w:val="000000" w:themeColor="text1"/>
+        </w:rPr>
+      </w:pPr>
+      <w:r>
+        <w:rPr>
+          <w:rFonts w:ascii="Times New Roman" w:hAnsi="Times New Roman" w:cs="Times New Roman"/>
+          <w:b/>
+          <w:bCs/>
+          <w:color w:val="0D0D0D" w:themeColor="text1" w:themeTint="F2"/>
+        </w:rPr>
+        <w:t>Member - National Society of Black Engineers (NSBE)</w:t>
+      </w:r>
+      <w:r>
+        <w:rPr>
+          <w:rFonts w:ascii="Times New Roman" w:hAnsi="Times New Roman" w:cs="Times New Roman"/>
+          <w:b/>
+          <w:bCs/>
+          <w:color w:val="0D0D0D" w:themeColor="text1" w:themeTint="F2"/>
+        </w:rPr>
         <w:tab/>
-        <w:t xml:space="preserve">    May 2024 – Present</w:t>
+      </w:r>
+      <w:r>
+        <w:rPr>
+          <w:rFonts w:ascii="Times New Roman" w:hAnsi="Times New Roman" w:cs="Times New Roman"/>
+          <w:b/>
+          <w:bCs/>
+          <w:color w:val="0D0D0D" w:themeColor="text1" w:themeTint="F2"/>
+        </w:rPr>
+        <w:tab/>
+        <w:t xml:space="preserve">    </w:t>
+      </w:r>
+      <w:r>
+        <w:rPr>
+          <w:rFonts w:ascii="Times New Roman" w:hAnsi="Times New Roman" w:cs="Times New Roman"/>
+          <w:b/>
+          <w:bCs/>
+          <w:color w:val="0D0D0D" w:themeColor="text1" w:themeTint="F2"/>
+        </w:rPr>
+        <w:t xml:space="preserve"> </w:t>
+      </w:r>
+      <w:r>
+        <w:rPr>
+          <w:rFonts w:ascii="Times New Roman" w:hAnsi="Times New Roman" w:cs="Times New Roman"/>
+          <w:b/>
+          <w:bCs/>
+          <w:color w:val="0D0D0D" w:themeColor="text1" w:themeTint="F2"/>
+        </w:rPr>
+        <w:t>May 2024 – Present</w:t>
       </w:r>
       <w:r>
         <w:rPr>

</xml_diff>